<commit_message>
Editable figure deck with placeholders and the figure-object generator
- artifacts/figures/pptx/Figures_revised.pptx (from the supplied Figures.pptx):
  Fig. 1 labels corrected (z-score input, background-referenced phase in the loss,
  mask 2 = spherocyte / 3 = echinocyte, S and m formulas, LoRA placement, typo);
  Fig. S-4, Fig. 6 (4 x 6 grid, headers, row labels, legend) and Fig. S-5 with
  named placeholders and editable 20 um scale bars
- make_figure_objects.py writes every panel as a bare image into
  artifacts/figures/objects/<figure>/ plus objects.json (needs data/processed)
- SI Fig. S-4 caption and text describe the new panel (full field, EdgeSAM r=32)

Co-Authored-By: Claude Opus 5.5 <noreply@anthropic.com>
Claude-Session: https://claude.ai/code/session_01VfeP9iXHsiwMyJPGSYpWbp
</commit_message>
<xml_diff>
--- a/artifacts/manuscript_final/for_submission/supplementary_information_final.docx
+++ b/artifacts/manuscript_final/for_submission/supplementary_information_final.docx
@@ -7179,8 +7179,25 @@
       <w:r>
         <w:rPr>
           <w:rFonts w:ascii="Times New Roman" w:hAnsi="Times New Roman" w:cs="Times New Roman"/>
+          <w:highlight w:val="yellow"/>
         </w:rPr>
-        <w:t>Fig. S-4 shows predicted cell contours on the phase-gradient magnitude for one validation window, as a qualitative illustration of the boundary cue used by the BGA term. Its quantitative effect is assessed by the loss ablation (Table 3 of the main text and Table S-2).</w:t>
+        <w:t xml:space="preserve">Fig. S-4 shows the predicted cell contours of EdgeSAM (</w:t>
+      </w:r>
+      <w:r>
+        <w:rPr>
+          <w:rFonts w:ascii="Times New Roman" w:hAnsi="Times New Roman" w:cs="Times New Roman"/>
+          <w:i/>
+          <w:iCs/>
+          <w:highlight w:val="yellow"/>
+        </w:rPr>
+        <w:t xml:space="preserve">r</w:t>
+      </w:r>
+      <w:r>
+        <w:rPr>
+          <w:rFonts w:ascii="Times New Roman" w:hAnsi="Times New Roman" w:cs="Times New Roman"/>
+          <w:highlight w:val="yellow"/>
+        </w:rPr>
+        <w:t xml:space="preserve">=32) on the phase-gradient magnitude for one validation image, as a qualitative illustration of the boundary cue used by the BGA term. Its quantitative effect is assessed by the loss ablation (Table 3 of the main text and Table S-2).</w:t>
       </w:r>
     </w:p>
     <w:p>
@@ -7259,7 +7276,7 @@
         <w:rPr>
           <w:highlight w:val="yellow"/>
         </w:rPr>
-        <w:t xml:space="preserve">Phase map, phase-gradient magnitude, and contours of EdgeSAM (</w:t>
+        <w:t xml:space="preserve">Phase map (rad), phase-gradient magnitude, and contours of EdgeSAM (</w:t>
       </w:r>
       <w:r>
         <w:rPr>
@@ -7273,21 +7290,7 @@
         <w:rPr>
           <w:highlight w:val="yellow"/>
         </w:rPr>
-        <w:t xml:space="preserve">=32) and MobileSAM (</w:t>
-      </w:r>
-      <w:r>
-        <w:rPr>
-          <w:i/>
-          <w:iCs/>
-          <w:highlight w:val="yellow"/>
-        </w:rPr>
-        <w:t xml:space="preserve">r</w:t>
-      </w:r>
-      <w:r>
-        <w:rPr>
-          <w:highlight w:val="yellow"/>
-        </w:rPr>
-        <w:t xml:space="preserve">=8) (seed 42) on the gradient magnitude. The window is the 256 × 256 px window with the most annotated foreground on a 32 px grid within the validation image with the most annotated foreground; it coincides with the discocyte window of Fig. 6 because discocytes dominate that image.</w:t>
+        <w:t xml:space="preserve">=32) (training seed 42) on the phase-gradient magnitude, for the full 768 × 768 px field (110.7 µm) of the validation image with the most annotated foreground. Scale bars: 20 µm.</w:t>
       </w:r>
     </w:p>
     <w:p>

</xml_diff>

<commit_message>
Fig. S-4 deck matches the SI window figure; Fig. 1 objects carry their colour bars
- make_figure_objects.py: Fig. S-4 objects are the SI window (256 px, grey phase, grey
  gradient, EdgeSAM (r=32) blue and MobileSAM (r=8) orange contours, 4x); the Fig. 1
  phase, z-score and volume objects are one image each with the colour bar and its
  printed values (limits / 0 / high-low), sized to the slide placeholders
- build_figures_pptx.py: slide 3 titles, legend, 20 um bars for a 36.89 um window and
  note; slides 1-2 placeholders with the combined aspect ratio, separate colour-bar
  number boxes removed; placeholders named after their object file
- SI Fig. S-4 caption and S-V paragraph back to the window / two-model wording

Co-Authored-By: Claude Opus 5.5 <noreply@anthropic.com>
Claude-Session: https://claude.ai/code/session_01VfeP9iXHsiwMyJPGSYpWbp
</commit_message>
<xml_diff>
--- a/artifacts/manuscript_final/for_submission/supplementary_information_final.docx
+++ b/artifacts/manuscript_final/for_submission/supplementary_information_final.docx
@@ -7181,23 +7181,7 @@
           <w:rFonts w:ascii="Times New Roman" w:hAnsi="Times New Roman" w:cs="Times New Roman"/>
           <w:highlight w:val="yellow"/>
         </w:rPr>
-        <w:t xml:space="preserve">Fig. S-4 shows the predicted cell contours of EdgeSAM (</w:t>
-      </w:r>
-      <w:r>
-        <w:rPr>
-          <w:rFonts w:ascii="Times New Roman" w:hAnsi="Times New Roman" w:cs="Times New Roman"/>
-          <w:i/>
-          <w:iCs/>
-          <w:highlight w:val="yellow"/>
-        </w:rPr>
-        <w:t xml:space="preserve">r</w:t>
-      </w:r>
-      <w:r>
-        <w:rPr>
-          <w:rFonts w:ascii="Times New Roman" w:hAnsi="Times New Roman" w:cs="Times New Roman"/>
-          <w:highlight w:val="yellow"/>
-        </w:rPr>
-        <w:t xml:space="preserve">=32) on the phase-gradient magnitude for one validation image, as a qualitative illustration of the boundary cue used by the BGA term. Its quantitative effect is assessed by the loss ablation (Table 3 of the main text and Table S-2).</w:t>
+        <w:t xml:space="preserve">Fig. S-4 shows predicted cell contours on the phase-gradient magnitude for one validation window, as a qualitative illustration of the boundary cue used by the BGA term. Its quantitative effect is assessed by the loss ablation (Table 3 of the main text and Table S-2).</w:t>
       </w:r>
     </w:p>
     <w:p>
@@ -7276,7 +7260,7 @@
         <w:rPr>
           <w:highlight w:val="yellow"/>
         </w:rPr>
-        <w:t xml:space="preserve">Phase map (rad), phase-gradient magnitude, and contours of EdgeSAM (</w:t>
+        <w:t xml:space="preserve">Phase map, phase-gradient magnitude, and contours of EdgeSAM (</w:t>
       </w:r>
       <w:r>
         <w:rPr>
@@ -7290,7 +7274,21 @@
         <w:rPr>
           <w:highlight w:val="yellow"/>
         </w:rPr>
-        <w:t xml:space="preserve">=32) (training seed 42) on the phase-gradient magnitude, for the full 768 × 768 px field (110.7 µm) of the validation image with the most annotated foreground. Scale bars: 20 µm.</w:t>
+        <w:t xml:space="preserve">=32) and MobileSAM (</w:t>
+      </w:r>
+      <w:r>
+        <w:rPr>
+          <w:i/>
+          <w:iCs/>
+          <w:highlight w:val="yellow"/>
+        </w:rPr>
+        <w:t xml:space="preserve">r</w:t>
+      </w:r>
+      <w:r>
+        <w:rPr>
+          <w:highlight w:val="yellow"/>
+        </w:rPr>
+        <w:t xml:space="preserve">=8) (seed 42) on the gradient magnitude. The window is the 256 × 256 px window with the most annotated foreground on a 32 px grid within the validation image with the most annotated foreground; it coincides with the discocyte window of Fig. 6 because discocytes dominate that image.</w:t>
       </w:r>
     </w:p>
     <w:p>

</xml_diff>